<commit_message>
Document a worked end-to-end example (mailbox_ip) in the project overview
Add Part 4 walking one real IP through the whole pipeline: DLD excerpts,
the actual extraction gaps report, the reviewed SEND_MESSAGE command,
gate/promotion commands, the real message_push process, the scenario->test
mapping, and a DLD->template->model->test traceability table. Renumber
Current status to Part 5 and drop the stale hardcoded test count. The
docx mirrors the same content with matching styles.

Co-Authored-By: Claude Fable 5 <noreply@anthropic.com>
</commit_message>
<xml_diff>
--- a/docs/project_overview.docx
+++ b/docs/project_overview.docx
@@ -29,7 +29,7 @@
           <w:b w:val="0"/>
           <w:i w:val="0"/>
         </w:rPr>
-        <w:t>This document answers three questions, in order:</w:t>
+        <w:t>This document answers four questions, in order:</w:t>
       </w:r>
     </w:p>
     <w:p>
@@ -58,6 +58,14 @@
     </w:p>
     <w:p>
       <w:pPr>
+        <w:pStyle w:val="ListNumber"/>
+      </w:pPr>
+      <w:r>
+        <w:t>Show me one real IP, end to end.  (Part 4)</w:t>
+      </w:r>
+    </w:p>
+    <w:p>
+      <w:pPr>
         <w:spacing w:after="160"/>
       </w:pPr>
       <w:r>
@@ -65,7 +73,7 @@
           <w:b w:val="0"/>
           <w:i w:val="0"/>
         </w:rPr>
-        <w:t>Current project status is in Part 4. The exact CLI command reference lives in the repository README. The diagrams in this document are also available as standalone SVG files in docs/diagrams/.</w:t>
+        <w:t>Current project status is in Part 5. The exact CLI command reference lives in the repository README. The diagrams in this document are also available as standalone SVG files in docs/diagrams/.</w:t>
       </w:r>
     </w:p>
     <w:p>
@@ -1932,7 +1940,1099 @@
         <w:pStyle w:val="Heading1"/>
       </w:pPr>
       <w:r>
-        <w:t>Part 4 — Current status</w:t>
+        <w:t>Part 4 — Worked example: mailbox_ip, end to end</w:t>
+      </w:r>
+    </w:p>
+    <w:p>
+      <w:pPr/>
+      <w:r>
+        <w:t>mailbox_ip was added to this repo through the exact pipeline described in Parts 2 and 3 — a brand-new DLD in, a validated model and tests out. Every artifact below exists in the repo, so you can open each file and follow along.</w:t>
+      </w:r>
+    </w:p>
+    <w:p>
+      <w:pPr>
+        <w:pStyle w:val="Heading2"/>
+      </w:pPr>
+      <w:r>
+        <w:t>The input: one markdown DLD</w:t>
+      </w:r>
+    </w:p>
+    <w:p>
+      <w:pPr/>
+      <w:r>
+        <w:t>dlds/mailbox_ip_dld.md describes a multi-channel inter-processor mailbox in ordinary prose: purpose and scope, four interfaces, five FSMs with their states, a per-FSM timing table, and an honest Open Items list. The parts the extractor will lean on look like this:</w:t>
+      </w:r>
+    </w:p>
+    <w:p>
+      <w:pPr/>
+      <w:r>
+        <w:rPr>
+          <w:rFonts w:ascii="Consolas" w:hAnsi="Consolas"/>
+          <w:sz w:val="19"/>
+        </w:rPr>
+        <w:t>### 6.2 Message Push FSM</w:t>
+        <w:br/>
+      </w:r>
+      <w:r>
+        <w:rPr>
+          <w:rFonts w:ascii="Consolas" w:hAnsi="Consolas"/>
+          <w:sz w:val="19"/>
+        </w:rPr>
+        <w:br/>
+      </w:r>
+      <w:r>
+        <w:rPr>
+          <w:rFonts w:ascii="Consolas" w:hAnsi="Consolas"/>
+          <w:sz w:val="19"/>
+        </w:rPr>
+        <w:t>Role: Accept sender messages and enqueue them into the channel FIFO.</w:t>
+        <w:br/>
+      </w:r>
+      <w:r>
+        <w:rPr>
+          <w:rFonts w:ascii="Consolas" w:hAnsi="Consolas"/>
+          <w:sz w:val="19"/>
+        </w:rPr>
+        <w:br/>
+      </w:r>
+      <w:r>
+        <w:rPr>
+          <w:rFonts w:ascii="Consolas" w:hAnsi="Consolas"/>
+          <w:sz w:val="19"/>
+        </w:rPr>
+        <w:t>States: IDLE, ACCEPT_MESSAGE, CHECK_SPACE, ENQUEUE, REJECT_FULL</w:t>
+        <w:br/>
+      </w:r>
+      <w:r>
+        <w:rPr>
+          <w:rFonts w:ascii="Consolas" w:hAnsi="Consolas"/>
+          <w:sz w:val="19"/>
+        </w:rPr>
+        <w:br/>
+      </w:r>
+      <w:r>
+        <w:rPr>
+          <w:rFonts w:ascii="Consolas" w:hAnsi="Consolas"/>
+          <w:sz w:val="19"/>
+        </w:rPr>
+        <w:t>| FSM/process      | Runs as                      | Delay model                       |</w:t>
+        <w:br/>
+      </w:r>
+      <w:r>
+        <w:rPr>
+          <w:rFonts w:ascii="Consolas" w:hAnsi="Consolas"/>
+          <w:sz w:val="19"/>
+        </w:rPr>
+        <w:t>| Message Push FSM | Parallel per-channel process | Accept message: 1 cycle = 2 ns. … |</w:t>
+      </w:r>
+    </w:p>
+    <w:p>
+      <w:pPr/>
+      <w:r>
+        <w:t>And what the author didn't know yet (section 12, Open Items): the number of channels, message width, FIFO depth per channel, interrupt target routing, and overflow-error behavior. These stay visible through the whole flow instead of being silently guessed.</w:t>
+      </w:r>
+    </w:p>
+    <w:p>
+      <w:pPr>
+        <w:pStyle w:val="Heading2"/>
+      </w:pPr>
+      <w:r>
+        <w:t>Step 1 — extract a draft spec + gaps report</w:t>
+      </w:r>
+    </w:p>
+    <w:p>
+      <w:pPr/>
+      <w:r>
+        <w:rPr>
+          <w:rFonts w:ascii="Consolas" w:hAnsi="Consolas"/>
+          <w:sz w:val="19"/>
+        </w:rPr>
+        <w:t>python tools\dld_to_template.py dlds\mailbox_ip_dld.md</w:t>
+      </w:r>
+    </w:p>
+    <w:p>
+      <w:pPr/>
+      <w:r>
+        <w:rPr>
+          <w:rFonts w:ascii="Consolas" w:hAnsi="Consolas"/>
+          <w:sz w:val="19"/>
+        </w:rPr>
+        <w:t>wrote draft:  templates\mailbox_ip.template.draft.yaml</w:t>
+        <w:br/>
+      </w:r>
+      <w:r>
+        <w:rPr>
+          <w:rFonts w:ascii="Consolas" w:hAnsi="Consolas"/>
+          <w:sz w:val="19"/>
+        </w:rPr>
+        <w:t>wrote report: reports\mailbox_ip.gaps.md</w:t>
+        <w:br/>
+      </w:r>
+      <w:r>
+        <w:rPr>
+          <w:rFonts w:ascii="Consolas" w:hAnsi="Consolas"/>
+          <w:sz w:val="19"/>
+        </w:rPr>
+        <w:t>wrote doc:    reports\template_docs\mailbox_ip.template.draft.html</w:t>
+        <w:br/>
+      </w:r>
+      <w:r>
+        <w:rPr>
+          <w:rFonts w:ascii="Consolas" w:hAnsi="Consolas"/>
+          <w:sz w:val="19"/>
+        </w:rPr>
+        <w:t>Next: resolve TODO_REVIEW markers, lint, check coverage, then promote.</w:t>
+      </w:r>
+    </w:p>
+    <w:p>
+      <w:pPr/>
+      <w:r>
+        <w:t>The extractor found the mechanical facts on its own, and flagged exactly the judgment-needing parts (this is the real report):</w:t>
+      </w:r>
+    </w:p>
+    <w:p>
+      <w:pPr/>
+      <w:r>
+        <w:rPr>
+          <w:rFonts w:ascii="Consolas" w:hAnsi="Consolas"/>
+          <w:sz w:val="19"/>
+        </w:rPr>
+        <w:t>## Extracted</w:t>
+        <w:br/>
+      </w:r>
+      <w:r>
+        <w:rPr>
+          <w:rFonts w:ascii="Consolas" w:hAnsi="Consolas"/>
+          <w:sz w:val="19"/>
+        </w:rPr>
+        <w:t>- FSMs (5): register_access, message_push, message_pop, doorbell, interrupt_notify</w:t>
+        <w:br/>
+      </w:r>
+      <w:r>
+        <w:rPr>
+          <w:rFonts w:ascii="Consolas" w:hAnsi="Consolas"/>
+          <w:sz w:val="19"/>
+        </w:rPr>
+        <w:t>- Interfaces (4): register_if, sender_message_if, receiver_message_if, interrupt_output_if</w:t>
+        <w:br/>
+      </w:r>
+      <w:r>
+        <w:rPr>
+          <w:rFonts w:ascii="Consolas" w:hAnsi="Consolas"/>
+          <w:sz w:val="19"/>
+        </w:rPr>
+        <w:t>- Declared fsm_count: 5</w:t>
+        <w:br/>
+      </w:r>
+      <w:r>
+        <w:rPr>
+          <w:rFonts w:ascii="Consolas" w:hAnsi="Consolas"/>
+          <w:sz w:val="19"/>
+        </w:rPr>
+        <w:br/>
+      </w:r>
+      <w:r>
+        <w:rPr>
+          <w:rFonts w:ascii="Consolas" w:hAnsi="Consolas"/>
+          <w:sz w:val="19"/>
+        </w:rPr>
+        <w:t>## Missing / To Review</w:t>
+        <w:br/>
+      </w:r>
+      <w:r>
+        <w:rPr>
+          <w:rFonts w:ascii="Consolas" w:hAnsi="Consolas"/>
+          <w:sz w:val="19"/>
+        </w:rPr>
+        <w:t>- commands: not derivable from DLD; TODO_REVIEW placeholder emitted</w:t>
+        <w:br/>
+      </w:r>
+      <w:r>
+        <w:rPr>
+          <w:rFonts w:ascii="Consolas" w:hAnsi="Consolas"/>
+          <w:sz w:val="19"/>
+        </w:rPr>
+        <w:t>- test_scenarios: author from DLD behavior; TODO_REVIEW placeholder emitted</w:t>
+        <w:br/>
+      </w:r>
+      <w:r>
+        <w:rPr>
+          <w:rFonts w:ascii="Consolas" w:hAnsi="Consolas"/>
+          <w:sz w:val="19"/>
+        </w:rPr>
+        <w:t>- functionality_model.invariants/apis/state_variables: complete from DLD</w:t>
+        <w:br/>
+      </w:r>
+      <w:r>
+        <w:rPr>
+          <w:rFonts w:ascii="Consolas" w:hAnsi="Consolas"/>
+          <w:sz w:val="19"/>
+        </w:rPr>
+        <w:br/>
+      </w:r>
+      <w:r>
+        <w:rPr>
+          <w:rFonts w:ascii="Consolas" w:hAnsi="Consolas"/>
+          <w:sz w:val="19"/>
+        </w:rPr>
+        <w:t>## DLD Open Items</w:t>
+        <w:br/>
+      </w:r>
+      <w:r>
+        <w:rPr>
+          <w:rFonts w:ascii="Consolas" w:hAnsi="Consolas"/>
+          <w:sz w:val="19"/>
+        </w:rPr>
+        <w:t>- Number of mailbox channels.</w:t>
+        <w:br/>
+      </w:r>
+      <w:r>
+        <w:rPr>
+          <w:rFonts w:ascii="Consolas" w:hAnsi="Consolas"/>
+          <w:sz w:val="19"/>
+        </w:rPr>
+        <w:t>- Message width.</w:t>
+        <w:br/>
+      </w:r>
+      <w:r>
+        <w:rPr>
+          <w:rFonts w:ascii="Consolas" w:hAnsi="Consolas"/>
+          <w:sz w:val="19"/>
+        </w:rPr>
+        <w:t>- FIFO depth per channel.</w:t>
+        <w:br/>
+      </w:r>
+      <w:r>
+        <w:rPr>
+          <w:rFonts w:ascii="Consolas" w:hAnsi="Consolas"/>
+          <w:sz w:val="19"/>
+        </w:rPr>
+        <w:t>- Interrupt target routing policy.</w:t>
+        <w:br/>
+      </w:r>
+      <w:r>
+        <w:rPr>
+          <w:rFonts w:ascii="Consolas" w:hAnsi="Consolas"/>
+          <w:sz w:val="19"/>
+        </w:rPr>
+        <w:t>- Whether an overflow raises an error interrupt.</w:t>
+      </w:r>
+    </w:p>
+    <w:p>
+      <w:pPr>
+        <w:pStyle w:val="Heading2"/>
+      </w:pPr>
+      <w:r>
+        <w:t>Step 2 — review: resolve every TODO_REVIEW</w:t>
+      </w:r>
+    </w:p>
+    <w:p>
+      <w:pPr/>
+      <w:r>
+        <w:t>A reviewer (human or LLM under the contract) replaced each marker using only DLD-stated behavior. For example, the DLD's Message Flow section (“a message is accepted only when the target channel FIFO has space; a full channel applies backpressure”) became this reviewed command entry:</w:t>
+      </w:r>
+    </w:p>
+    <w:p>
+      <w:pPr/>
+      <w:r>
+        <w:rPr>
+          <w:rFonts w:ascii="Consolas" w:hAnsi="Consolas"/>
+          <w:sz w:val="19"/>
+        </w:rPr>
+        <w:t>- name: SEND_MESSAGE</w:t>
+        <w:br/>
+      </w:r>
+      <w:r>
+        <w:rPr>
+          <w:rFonts w:ascii="Consolas" w:hAnsi="Consolas"/>
+          <w:sz w:val="19"/>
+        </w:rPr>
+        <w:t xml:space="preserve">  description: Sender writes a message into a channel FIFO.</w:t>
+        <w:br/>
+      </w:r>
+      <w:r>
+        <w:rPr>
+          <w:rFonts w:ascii="Consolas" w:hAnsi="Consolas"/>
+          <w:sz w:val="19"/>
+        </w:rPr>
+        <w:t xml:space="preserve">  fields: [channel_id, message]</w:t>
+        <w:br/>
+      </w:r>
+      <w:r>
+        <w:rPr>
+          <w:rFonts w:ascii="Consolas" w:hAnsi="Consolas"/>
+          <w:sz w:val="19"/>
+        </w:rPr>
+        <w:t xml:space="preserve">  valid_conditions: [channel_enabled, fifo_has_space]</w:t>
+        <w:br/>
+      </w:r>
+      <w:r>
+        <w:rPr>
+          <w:rFonts w:ascii="Consolas" w:hAnsi="Consolas"/>
+          <w:sz w:val="19"/>
+        </w:rPr>
+        <w:t xml:space="preserve">  completion_conditions: [message_enqueued]</w:t>
+        <w:br/>
+      </w:r>
+      <w:r>
+        <w:rPr>
+          <w:rFonts w:ascii="Consolas" w:hAnsi="Consolas"/>
+          <w:sz w:val="19"/>
+        </w:rPr>
+        <w:t xml:space="preserve">  error_conditions: [fifo_full]</w:t>
+        <w:br/>
+      </w:r>
+      <w:r>
+        <w:rPr>
+          <w:rFonts w:ascii="Consolas" w:hAnsi="Consolas"/>
+          <w:sz w:val="19"/>
+        </w:rPr>
+        <w:t xml:space="preserve">  functional_effects: [enqueue_message, raise_doorbell]</w:t>
+        <w:br/>
+      </w:r>
+      <w:r>
+        <w:rPr>
+          <w:rFonts w:ascii="Consolas" w:hAnsi="Consolas"/>
+          <w:sz w:val="19"/>
+        </w:rPr>
+        <w:t xml:space="preserve">  timing_effects: [push_delay]</w:t>
+      </w:r>
+    </w:p>
+    <w:p>
+      <w:pPr/>
+      <w:r>
+        <w:t>The unresolved Open Items were handled the conservative way: channel count and FIFO depth became model constructor parameters with bounded defaults (num_channels=4, fifo_depth=8, recorded in the template's queues: section), so experiments can sweep them and nothing is hard-wired on a guess.</w:t>
+      </w:r>
+    </w:p>
+    <w:p>
+      <w:pPr>
+        <w:pStyle w:val="Heading2"/>
+      </w:pPr>
+      <w:r>
+        <w:t>Step 3 — pass the gates, promote to golden</w:t>
+      </w:r>
+    </w:p>
+    <w:p>
+      <w:pPr/>
+      <w:r>
+        <w:rPr>
+          <w:rFonts w:ascii="Consolas" w:hAnsi="Consolas"/>
+          <w:sz w:val="19"/>
+        </w:rPr>
+        <w:t>python tools\check_template_coverage.py templates\mailbox_ip.template.draft.yaml dlds\mailbox_ip_dld.md --strict</w:t>
+        <w:br/>
+      </w:r>
+      <w:r>
+        <w:rPr>
+          <w:rFonts w:ascii="Consolas" w:hAnsi="Consolas"/>
+          <w:sz w:val="19"/>
+        </w:rPr>
+        <w:t>python tools\template_lint.py templates\mailbox_ip.template.yaml</w:t>
+      </w:r>
+    </w:p>
+    <w:p>
+      <w:pPr/>
+      <w:r>
+        <w:t>For mailbox_ip these proved: all five DLD FSM names and the declared fsm_count: 5 are captured, every state list matches, zero TODO_REVIEW markers remain, and the YAML satisfies the schema/contract. The draft was then renamed to the golden templates/mailbox_ip.template.yaml — from here on, the DLD is never read again.</w:t>
+      </w:r>
+    </w:p>
+    <w:p>
+      <w:pPr>
+        <w:pStyle w:val="Heading2"/>
+      </w:pPr>
+      <w:r>
+        <w:t>Step 4 — scaffold + implement the model</w:t>
+      </w:r>
+    </w:p>
+    <w:p>
+      <w:pPr/>
+      <w:r>
+        <w:rPr>
+          <w:rFonts w:ascii="Consolas" w:hAnsi="Consolas"/>
+          <w:sz w:val="19"/>
+        </w:rPr>
+        <w:t>python tools\generate_model_scaffold.py templates\mailbox_ip.template.yaml --output-dir src\ip_model_automation</w:t>
+      </w:r>
+    </w:p>
+    <w:p>
+      <w:pPr/>
+      <w:r>
+        <w:t>Each of the five template FSMs became one concurrent SimPy process in src/ip_model_automation/mailbox_ip.py (the process/queue picture is Figure 5 in Part 3). Here is the real message_push process — note how every line traces back to the template: the state names, the message_fifo bounded queue, the doorbell hand-off, and the REJECT_FULL drop path:</w:t>
+      </w:r>
+    </w:p>
+    <w:p>
+      <w:pPr/>
+      <w:r>
+        <w:rPr>
+          <w:rFonts w:ascii="Consolas" w:hAnsi="Consolas"/>
+          <w:sz w:val="19"/>
+        </w:rPr>
+        <w:t>def message_push_process(self):</w:t>
+        <w:br/>
+      </w:r>
+      <w:r>
+        <w:rPr>
+          <w:rFonts w:ascii="Consolas" w:hAnsi="Consolas"/>
+          <w:sz w:val="19"/>
+        </w:rPr>
+        <w:t xml:space="preserve">    while True:</w:t>
+        <w:br/>
+      </w:r>
+      <w:r>
+        <w:rPr>
+          <w:rFonts w:ascii="Consolas" w:hAnsi="Consolas"/>
+          <w:sz w:val="19"/>
+        </w:rPr>
+        <w:t xml:space="preserve">        self.fsm_state["message_push"] = "IDLE"</w:t>
+        <w:br/>
+      </w:r>
+      <w:r>
+        <w:rPr>
+          <w:rFonts w:ascii="Consolas" w:hAnsi="Consolas"/>
+          <w:sz w:val="19"/>
+        </w:rPr>
+        <w:t xml:space="preserve">        channel_id, message = yield self.sender_if.get()</w:t>
+        <w:br/>
+      </w:r>
+      <w:r>
+        <w:rPr>
+          <w:rFonts w:ascii="Consolas" w:hAnsi="Consolas"/>
+          <w:sz w:val="19"/>
+        </w:rPr>
+        <w:t xml:space="preserve">        self.fsm_state["message_push"] = "ACCEPT_MESSAGE"</w:t>
+        <w:br/>
+      </w:r>
+      <w:r>
+        <w:rPr>
+          <w:rFonts w:ascii="Consolas" w:hAnsi="Consolas"/>
+          <w:sz w:val="19"/>
+        </w:rPr>
+        <w:t xml:space="preserve">        yield self.env.timeout(self.lat["push"])</w:t>
+        <w:br/>
+      </w:r>
+      <w:r>
+        <w:rPr>
+          <w:rFonts w:ascii="Consolas" w:hAnsi="Consolas"/>
+          <w:sz w:val="19"/>
+        </w:rPr>
+        <w:t xml:space="preserve">        self.fsm_state["message_push"] = "CHECK_SPACE"</w:t>
+        <w:br/>
+      </w:r>
+      <w:r>
+        <w:rPr>
+          <w:rFonts w:ascii="Consolas" w:hAnsi="Consolas"/>
+          <w:sz w:val="19"/>
+        </w:rPr>
+        <w:t xml:space="preserve">        fifo = self.message_fifos[channel_id]</w:t>
+        <w:br/>
+      </w:r>
+      <w:r>
+        <w:rPr>
+          <w:rFonts w:ascii="Consolas" w:hAnsi="Consolas"/>
+          <w:sz w:val="19"/>
+        </w:rPr>
+        <w:t xml:space="preserve">        if len(fifo) &lt; self.fifo_depth:</w:t>
+        <w:br/>
+      </w:r>
+      <w:r>
+        <w:rPr>
+          <w:rFonts w:ascii="Consolas" w:hAnsi="Consolas"/>
+          <w:sz w:val="19"/>
+        </w:rPr>
+        <w:t xml:space="preserve">            fifo.append(message)</w:t>
+        <w:br/>
+      </w:r>
+      <w:r>
+        <w:rPr>
+          <w:rFonts w:ascii="Consolas" w:hAnsi="Consolas"/>
+          <w:sz w:val="19"/>
+        </w:rPr>
+        <w:t xml:space="preserve">            self.fsm_state["message_push"] = "ENQUEUE"</w:t>
+        <w:br/>
+      </w:r>
+      <w:r>
+        <w:rPr>
+          <w:rFonts w:ascii="Consolas" w:hAnsi="Consolas"/>
+          <w:sz w:val="19"/>
+        </w:rPr>
+        <w:t xml:space="preserve">            self.metrics["enqueued_messages"] += 1</w:t>
+        <w:br/>
+      </w:r>
+      <w:r>
+        <w:rPr>
+          <w:rFonts w:ascii="Consolas" w:hAnsi="Consolas"/>
+          <w:sz w:val="19"/>
+        </w:rPr>
+        <w:t xml:space="preserve">            yield self.doorbell_queue.put(channel_id)</w:t>
+        <w:br/>
+      </w:r>
+      <w:r>
+        <w:rPr>
+          <w:rFonts w:ascii="Consolas" w:hAnsi="Consolas"/>
+          <w:sz w:val="19"/>
+        </w:rPr>
+        <w:t xml:space="preserve">        else:</w:t>
+        <w:br/>
+      </w:r>
+      <w:r>
+        <w:rPr>
+          <w:rFonts w:ascii="Consolas" w:hAnsi="Consolas"/>
+          <w:sz w:val="19"/>
+        </w:rPr>
+        <w:t xml:space="preserve">            self.fsm_state["message_push"] = "REJECT_FULL"</w:t>
+        <w:br/>
+      </w:r>
+      <w:r>
+        <w:rPr>
+          <w:rFonts w:ascii="Consolas" w:hAnsi="Consolas"/>
+          <w:sz w:val="19"/>
+        </w:rPr>
+        <w:t xml:space="preserve">            self.metrics["dropped_on_full"] += 1</w:t>
+        <w:br/>
+      </w:r>
+      <w:r>
+        <w:rPr>
+          <w:rFonts w:ascii="Consolas" w:hAnsi="Consolas"/>
+          <w:sz w:val="19"/>
+        </w:rPr>
+        <w:t xml:space="preserve">            self.logger.warning("channel fifo full channel=%s message dropped", channel_id)</w:t>
+      </w:r>
+    </w:p>
+    <w:p>
+      <w:pPr>
+        <w:pStyle w:val="Heading2"/>
+      </w:pPr>
+      <w:r>
+        <w:t>Step 5 — unit tests from the template's scenarios</w:t>
+      </w:r>
+    </w:p>
+    <w:p>
+      <w:pPr/>
+      <w:r>
+        <w:t>The template's test_scenarios: section is the test plan. Its second scenario:</w:t>
+      </w:r>
+    </w:p>
+    <w:p>
+      <w:pPr/>
+      <w:r>
+        <w:rPr>
+          <w:rFonts w:ascii="Consolas" w:hAnsi="Consolas"/>
+          <w:sz w:val="19"/>
+        </w:rPr>
+        <w:t>- name: full_fifo_applies_backpressure</w:t>
+        <w:br/>
+      </w:r>
+      <w:r>
+        <w:rPr>
+          <w:rFonts w:ascii="Consolas" w:hAnsi="Consolas"/>
+          <w:sz w:val="19"/>
+        </w:rPr>
+        <w:t xml:space="preserve">  description: Sending beyond FIFO depth drops or stalls messages on a full channel.</w:t>
+        <w:br/>
+      </w:r>
+      <w:r>
+        <w:rPr>
+          <w:rFonts w:ascii="Consolas" w:hAnsi="Consolas"/>
+          <w:sz w:val="19"/>
+        </w:rPr>
+        <w:t xml:space="preserve">  input_sequence: [CONFIG_CHANNEL_0, SEND_MESSAGE_BURST]</w:t>
+        <w:br/>
+      </w:r>
+      <w:r>
+        <w:rPr>
+          <w:rFonts w:ascii="Consolas" w:hAnsi="Consolas"/>
+          <w:sz w:val="19"/>
+        </w:rPr>
+        <w:t xml:space="preserve">  expected_functional_behavior: [dropped_on_full_counted]</w:t>
+        <w:br/>
+      </w:r>
+      <w:r>
+        <w:rPr>
+          <w:rFonts w:ascii="Consolas" w:hAnsi="Consolas"/>
+          <w:sz w:val="19"/>
+        </w:rPr>
+        <w:t xml:space="preserve">  fsm_coverage: [message_push.CHECK_SPACE, message_push.REJECT_FULL]</w:t>
+      </w:r>
+    </w:p>
+    <w:p>
+      <w:pPr/>
+      <w:r>
+        <w:t>became this test in tests/test_mailbox_ip.py:</w:t>
+      </w:r>
+    </w:p>
+    <w:p>
+      <w:pPr/>
+      <w:r>
+        <w:rPr>
+          <w:rFonts w:ascii="Consolas" w:hAnsi="Consolas"/>
+          <w:sz w:val="19"/>
+        </w:rPr>
+        <w:t>def test_full_fifo_applies_backpressure(self):</w:t>
+        <w:br/>
+      </w:r>
+      <w:r>
+        <w:rPr>
+          <w:rFonts w:ascii="Consolas" w:hAnsi="Consolas"/>
+          <w:sz w:val="19"/>
+        </w:rPr>
+        <w:t xml:space="preserve">    env = simpy.Environment()</w:t>
+        <w:br/>
+      </w:r>
+      <w:r>
+        <w:rPr>
+          <w:rFonts w:ascii="Consolas" w:hAnsi="Consolas"/>
+          <w:sz w:val="19"/>
+        </w:rPr>
+        <w:t xml:space="preserve">    model = MailboxIpModel(env, fifo_depth=4)</w:t>
+        <w:br/>
+      </w:r>
+      <w:r>
+        <w:rPr>
+          <w:rFonts w:ascii="Consolas" w:hAnsi="Consolas"/>
+          <w:sz w:val="19"/>
+        </w:rPr>
+        <w:t xml:space="preserve">    model.set_receiver_enabled(False)</w:t>
+        <w:br/>
+      </w:r>
+      <w:r>
+        <w:rPr>
+          <w:rFonts w:ascii="Consolas" w:hAnsi="Consolas"/>
+          <w:sz w:val="19"/>
+        </w:rPr>
+        <w:t xml:space="preserve">    model.configure_channel(0)</w:t>
+        <w:br/>
+      </w:r>
+      <w:r>
+        <w:rPr>
+          <w:rFonts w:ascii="Consolas" w:hAnsi="Consolas"/>
+          <w:sz w:val="19"/>
+        </w:rPr>
+        <w:t xml:space="preserve">    for index in range(6):</w:t>
+        <w:br/>
+      </w:r>
+      <w:r>
+        <w:rPr>
+          <w:rFonts w:ascii="Consolas" w:hAnsi="Consolas"/>
+          <w:sz w:val="19"/>
+        </w:rPr>
+        <w:t xml:space="preserve">        model.send_message(0, f"m{index}")</w:t>
+        <w:br/>
+      </w:r>
+      <w:r>
+        <w:rPr>
+          <w:rFonts w:ascii="Consolas" w:hAnsi="Consolas"/>
+          <w:sz w:val="19"/>
+        </w:rPr>
+        <w:t xml:space="preserve">    env.run(until=20)</w:t>
+        <w:br/>
+      </w:r>
+      <w:r>
+        <w:rPr>
+          <w:rFonts w:ascii="Consolas" w:hAnsi="Consolas"/>
+          <w:sz w:val="19"/>
+        </w:rPr>
+        <w:t xml:space="preserve">    self.assertEqual(model.metrics["enqueued_messages"], 4)</w:t>
+        <w:br/>
+      </w:r>
+      <w:r>
+        <w:rPr>
+          <w:rFonts w:ascii="Consolas" w:hAnsi="Consolas"/>
+          <w:sz w:val="19"/>
+        </w:rPr>
+        <w:t xml:space="preserve">    self.assertEqual(model.metrics["dropped_on_full"], 2)</w:t>
+      </w:r>
+    </w:p>
+    <w:p>
+      <w:pPr/>
+      <w:r>
+        <w:t>Six sends into a depth-4 FIFO with the receiver stalled: exactly 4 enqueue, exactly 2 hit REJECT_FULL — the DLD's backpressure statement, now executable.</w:t>
+      </w:r>
+    </w:p>
+    <w:p>
+      <w:pPr>
+        <w:pStyle w:val="Heading2"/>
+      </w:pPr>
+      <w:r>
+        <w:t>Step 6 — the repo-wide gate</w:t>
+      </w:r>
+    </w:p>
+    <w:p>
+      <w:pPr/>
+      <w:r>
+        <w:rPr>
+          <w:rFonts w:ascii="Consolas" w:hAnsi="Consolas"/>
+          <w:sz w:val="19"/>
+        </w:rPr>
+        <w:t>python tools\validate_dld_flow.py</w:t>
+      </w:r>
+    </w:p>
+    <w:p>
+      <w:pPr/>
+      <w:r>
+        <w:t>Green means, for mailbox_ip specifically: its template lints and covers its DLD, the scaffold check finds the model class with one process per FSM, every FSM appears in a test scenario, and its unit tests pass alongside the rest of the suite. From that point mailbox_ip is a first-class citizen — it was later reused unchanged as the doorbell source inside the mailbox_irq_subsystem.</w:t>
+      </w:r>
+    </w:p>
+    <w:p>
+      <w:pPr>
+        <w:pStyle w:val="Heading2"/>
+      </w:pPr>
+      <w:r>
+        <w:t>Where each DLD statement ended up</w:t>
+      </w:r>
+    </w:p>
+    <w:tbl>
+      <w:tblPr>
+        <w:tblStyle w:val="TableGrid"/>
+        <w:tblW w:type="auto" w:w="0"/>
+        <w:tblLook w:firstColumn="1" w:firstRow="1" w:lastColumn="0" w:lastRow="0" w:noHBand="0" w:noVBand="1" w:val="04A0"/>
+      </w:tblPr>
+      <w:tblGrid>
+        <w:gridCol w:w="2340"/>
+        <w:gridCol w:w="2340"/>
+        <w:gridCol w:w="2340"/>
+        <w:gridCol w:w="2340"/>
+      </w:tblGrid>
+      <w:tr>
+        <w:tc>
+          <w:tcPr>
+            <w:tcW w:type="dxa" w:w="2340"/>
+          </w:tcPr>
+          <w:p>
+            <w:r>
+              <w:rPr>
+                <w:b/>
+                <w:sz w:val="18"/>
+              </w:rPr>
+              <w:t>DLD says</w:t>
+            </w:r>
+          </w:p>
+        </w:tc>
+        <w:tc>
+          <w:tcPr>
+            <w:tcW w:type="dxa" w:w="2340"/>
+          </w:tcPr>
+          <w:p>
+            <w:r>
+              <w:rPr>
+                <w:b/>
+                <w:sz w:val="18"/>
+              </w:rPr>
+              <w:t>Template captures it as</w:t>
+            </w:r>
+          </w:p>
+        </w:tc>
+        <w:tc>
+          <w:tcPr>
+            <w:tcW w:type="dxa" w:w="2340"/>
+          </w:tcPr>
+          <w:p>
+            <w:r>
+              <w:rPr>
+                <w:b/>
+                <w:sz w:val="18"/>
+              </w:rPr>
+              <w:t>Model implements it</w:t>
+            </w:r>
+          </w:p>
+        </w:tc>
+        <w:tc>
+          <w:tcPr>
+            <w:tcW w:type="dxa" w:w="2340"/>
+          </w:tcPr>
+          <w:p>
+            <w:r>
+              <w:rPr>
+                <w:b/>
+                <w:sz w:val="18"/>
+              </w:rPr>
+              <w:t>Test proves it</w:t>
+            </w:r>
+          </w:p>
+        </w:tc>
+      </w:tr>
+      <w:tr>
+        <w:tc>
+          <w:tcPr>
+            <w:tcW w:type="dxa" w:w="2340"/>
+          </w:tcPr>
+          <w:p>
+            <w:r>
+              <w:rPr>
+                <w:sz w:val="18"/>
+              </w:rPr>
+              <w:t>“A full channel applies backpressure to the sender” (§4.2)</w:t>
+            </w:r>
+          </w:p>
+        </w:tc>
+        <w:tc>
+          <w:tcPr>
+            <w:tcW w:type="dxa" w:w="2340"/>
+          </w:tcPr>
+          <w:p>
+            <w:r>
+              <w:rPr>
+                <w:sz w:val="18"/>
+              </w:rPr>
+              <w:t>SEND_MESSAGE.error_conditions: [fifo_full]; queues.message_fifo.blocking_behavior: backpressure</w:t>
+            </w:r>
+          </w:p>
+        </w:tc>
+        <w:tc>
+          <w:tcPr>
+            <w:tcW w:type="dxa" w:w="2340"/>
+          </w:tcPr>
+          <w:p>
+            <w:r>
+              <w:rPr>
+                <w:sz w:val="18"/>
+              </w:rPr>
+              <w:t>message_push_process REJECT_FULL branch</w:t>
+            </w:r>
+          </w:p>
+        </w:tc>
+        <w:tc>
+          <w:tcPr>
+            <w:tcW w:type="dxa" w:w="2340"/>
+          </w:tcPr>
+          <w:p>
+            <w:r>
+              <w:rPr>
+                <w:sz w:val="18"/>
+              </w:rPr>
+              <w:t>test_full_fifo_applies_backpressure</w:t>
+            </w:r>
+          </w:p>
+        </w:tc>
+      </w:tr>
+      <w:tr>
+        <w:tc>
+          <w:tcPr>
+            <w:tcW w:type="dxa" w:w="2340"/>
+          </w:tcPr>
+          <w:p>
+            <w:r>
+              <w:rPr>
+                <w:sz w:val="18"/>
+              </w:rPr>
+              <w:t>“Enqueue precedes doorbell; doorbell precedes interrupt” (§11)</w:t>
+            </w:r>
+          </w:p>
+        </w:tc>
+        <w:tc>
+          <w:tcPr>
+            <w:tcW w:type="dxa" w:w="2340"/>
+          </w:tcPr>
+          <w:p>
+            <w:r>
+              <w:rPr>
+                <w:sz w:val="18"/>
+              </w:rPr>
+              <w:t>sequential_paths: message_to_interrupt_path</w:t>
+            </w:r>
+          </w:p>
+        </w:tc>
+        <w:tc>
+          <w:tcPr>
+            <w:tcW w:type="dxa" w:w="2340"/>
+          </w:tcPr>
+          <w:p>
+            <w:r>
+              <w:rPr>
+                <w:sz w:val="18"/>
+              </w:rPr>
+              <w:t>doorbell_queue → interrupt_pending_queue hand-offs</w:t>
+            </w:r>
+          </w:p>
+        </w:tc>
+        <w:tc>
+          <w:tcPr>
+            <w:tcW w:type="dxa" w:w="2340"/>
+          </w:tcPr>
+          <w:p>
+            <w:r>
+              <w:rPr>
+                <w:sz w:val="18"/>
+              </w:rPr>
+              <w:t>test_message_enqueue_delivers_and_interrupts</w:t>
+            </w:r>
+          </w:p>
+        </w:tc>
+      </w:tr>
+      <w:tr>
+        <w:tc>
+          <w:tcPr>
+            <w:tcW w:type="dxa" w:w="2340"/>
+          </w:tcPr>
+          <w:p>
+            <w:r>
+              <w:rPr>
+                <w:sz w:val="18"/>
+              </w:rPr>
+              <w:t>“Doorbell interrupt is level, asserted until software clears” (§4.4)</w:t>
+            </w:r>
+          </w:p>
+        </w:tc>
+        <w:tc>
+          <w:tcPr>
+            <w:tcW w:type="dxa" w:w="2340"/>
+          </w:tcPr>
+          <w:p>
+            <w:r>
+              <w:rPr>
+                <w:sz w:val="18"/>
+              </w:rPr>
+              <w:t>invariant: “stays asserted until software clears it”</w:t>
+            </w:r>
+          </w:p>
+        </w:tc>
+        <w:tc>
+          <w:tcPr>
+            <w:tcW w:type="dxa" w:w="2340"/>
+          </w:tcPr>
+          <w:p>
+            <w:r>
+              <w:rPr>
+                <w:sz w:val="18"/>
+              </w:rPr>
+              <w:t>clear_interrupt() API + doorbell_status set</w:t>
+            </w:r>
+          </w:p>
+        </w:tc>
+        <w:tc>
+          <w:tcPr>
+            <w:tcW w:type="dxa" w:w="2340"/>
+          </w:tcPr>
+          <w:p>
+            <w:r>
+              <w:rPr>
+                <w:sz w:val="18"/>
+              </w:rPr>
+              <w:t>subsystem tests (mailbox_irq_subsystem)</w:t>
+            </w:r>
+          </w:p>
+        </w:tc>
+      </w:tr>
+      <w:tr>
+        <w:tc>
+          <w:tcPr>
+            <w:tcW w:type="dxa" w:w="2340"/>
+          </w:tcPr>
+          <w:p>
+            <w:r>
+              <w:rPr>
+                <w:sz w:val="18"/>
+              </w:rPr>
+              <w:t>Per-FSM cycle counts (§11 timing table)</w:t>
+            </w:r>
+          </w:p>
+        </w:tc>
+        <w:tc>
+          <w:tcPr>
+            <w:tcW w:type="dxa" w:w="2340"/>
+          </w:tcPr>
+          <w:p>
+            <w:r>
+              <w:rPr>
+                <w:sz w:val="18"/>
+              </w:rPr>
+              <w:t>timing_model.fsm_process_delays</w:t>
+            </w:r>
+          </w:p>
+        </w:tc>
+        <w:tc>
+          <w:tcPr>
+            <w:tcW w:type="dxa" w:w="2340"/>
+          </w:tcPr>
+          <w:p>
+            <w:r>
+              <w:rPr>
+                <w:sz w:val="18"/>
+              </w:rPr>
+              <w:t>latency constructor parameters (self.lat)</w:t>
+            </w:r>
+          </w:p>
+        </w:tc>
+        <w:tc>
+          <w:tcPr>
+            <w:tcW w:type="dxa" w:w="2340"/>
+          </w:tcPr>
+          <w:p>
+            <w:r>
+              <w:rPr>
+                <w:sz w:val="18"/>
+              </w:rPr>
+              <w:t>timing assertions in per-IP tests</w:t>
+            </w:r>
+          </w:p>
+        </w:tc>
+      </w:tr>
+      <w:tr>
+        <w:tc>
+          <w:tcPr>
+            <w:tcW w:type="dxa" w:w="2340"/>
+          </w:tcPr>
+          <w:p>
+            <w:r>
+              <w:rPr>
+                <w:sz w:val="18"/>
+              </w:rPr>
+              <w:t>Open Items: channel count, FIFO depth (§12)</w:t>
+            </w:r>
+          </w:p>
+        </w:tc>
+        <w:tc>
+          <w:tcPr>
+            <w:tcW w:type="dxa" w:w="2340"/>
+          </w:tcPr>
+          <w:p>
+            <w:r>
+              <w:rPr>
+                <w:sz w:val="18"/>
+              </w:rPr>
+              <w:t>gaps report + queues.message_fifo.depth</w:t>
+            </w:r>
+          </w:p>
+        </w:tc>
+        <w:tc>
+          <w:tcPr>
+            <w:tcW w:type="dxa" w:w="2340"/>
+          </w:tcPr>
+          <w:p>
+            <w:r>
+              <w:rPr>
+                <w:sz w:val="18"/>
+              </w:rPr>
+              <w:t>num_channels / fifo_depth constructor parameters</w:t>
+            </w:r>
+          </w:p>
+        </w:tc>
+        <w:tc>
+          <w:tcPr>
+            <w:tcW w:type="dxa" w:w="2340"/>
+          </w:tcPr>
+          <w:p>
+            <w:r>
+              <w:rPr>
+                <w:sz w:val="18"/>
+              </w:rPr>
+              <w:t>swept by run_experiments.py scenarios</w:t>
+            </w:r>
+          </w:p>
+        </w:tc>
+      </w:tr>
+    </w:tbl>
+    <w:p>
+      <w:pPr/>
+      <w:r>
+        <w:t>One footnote: this walkthrough shows the manual, stage-by-stage path so each artifact is visible. Today the automated runner does all of it from the DLD drop onward — python tools\auto_ip_pipeline.py (Part 3).</w:t>
+      </w:r>
+    </w:p>
+    <w:p>
+      <w:pPr>
+        <w:pStyle w:val="Heading1"/>
+      </w:pPr>
+      <w:r>
+        <w:t>Part 5 — Current status</w:t>
       </w:r>
     </w:p>
     <w:p>
@@ -1945,7 +3045,7 @@
           <w:b/>
           <w:i w:val="0"/>
         </w:rPr>
-        <w:t>As of 2026-07-09: all gates green — validate_dld_flow.py OK, 60 unit tests passing.</w:t>
+        <w:t>As of 2026-07-12: all gates green — validate_dld_flow.py OK, full unit suite passing (run it for the current count).</w:t>
       </w:r>
     </w:p>
     <w:p>

</xml_diff>

<commit_message>
Add a coding style guide and enforce it as a pipeline gate
Introduce skills/ip-model-generation/references/coding_style.md codifying
the repo's model/test conventions, with the mechanical rules in ruff.toml
(ruff lint E/F/W/I + formatter, 120 columns, sorted imports). Enforce via
tools/check_code_style.py (--fix to auto-repair), wired as a required
repo-scope stage in the harness YAML before code_coverage. Prompt packs
now carry a Coding Style section so implementing agents follow the guide.
One-time normalization: ruff reformatted 23 files; long string literals
split and an ambiguous variable renamed by hand. All gates green.

Co-Authored-By: Claude Fable 5 <noreply@anthropic.com>
</commit_message>
<xml_diff>
--- a/docs/project_overview.docx
+++ b/docs/project_overview.docx
@@ -1321,6 +1321,14 @@
       </w:pPr>
       <w:r>
         <w:t>Per-IP tests in tests/test_&lt;ip&gt;.py, derived from the template's test_scenarios.</w:t>
+      </w:r>
+    </w:p>
+    <w:p>
+      <w:pPr>
+        <w:pStyle w:val="ListBullet"/>
+      </w:pPr>
+      <w:r>
+        <w:t>A written coding style guide, skills/ip-model-generation/references/coding_style.md, codifies formatting (ruff, 120 columns, sorted imports) and the model/test structure conventions. It is enforced as a hard repo-wide pipeline gate — python tools\check_code_style.py (add --fix to auto-repair) — and every prompt pack instructs the implementing agent to follow it.</w:t>
       </w:r>
     </w:p>
     <w:p>

</xml_diff>

<commit_message>
Document the coding style guide in the project overview (md + docx)
Add a Coding style subsection to Part 3 covering the ruff-enforced rules
and the model/test structure conventions, note the repo-wide code_style
and coverage hard gates in the gates section (fixing the stale
"informational" coverage claim), and record the style gate in the Part 5
pipeline-maturity list. Docx mirrored with matching styles.

Co-Authored-By: Claude Fable 5 <noreply@anthropic.com>
</commit_message>
<xml_diff>
--- a/docs/project_overview.docx
+++ b/docs/project_overview.docx
@@ -1328,7 +1328,7 @@
         <w:pStyle w:val="ListBullet"/>
       </w:pPr>
       <w:r>
-        <w:t>A written coding style guide, skills/ip-model-generation/references/coding_style.md, codifies formatting (ruff, 120 columns, sorted imports) and the model/test structure conventions. It is enforced as a hard repo-wide pipeline gate — python tools\check_code_style.py (add --fix to auto-repair) — and every prompt pack instructs the implementing agent to follow it.</w:t>
+        <w:t>Every Python file follows the written coding style guide (next section).</w:t>
       </w:r>
     </w:p>
     <w:p>
@@ -1371,6 +1371,126 @@
           <w:sz w:val="19"/>
         </w:rPr>
         <w:t>python -m unittest discover -s tests</w:t>
+      </w:r>
+    </w:p>
+    <w:p>
+      <w:pPr>
+        <w:pStyle w:val="Heading3"/>
+      </w:pPr>
+      <w:r>
+        <w:t>Coding style</w:t>
+      </w:r>
+    </w:p>
+    <w:p>
+      <w:pPr/>
+      <w:r>
+        <w:t>All Python code in src/, tools/, and tests/ follows one written style guide: skills/ip-model-generation/references/coding_style.md. It has two halves:</w:t>
+      </w:r>
+    </w:p>
+    <w:p>
+      <w:pPr/>
+      <w:r>
+        <w:t>Machine-enforced rules — configured in ruff.toml at the repo root and checked by ruff (linter + formatter in one tool, installed via requirements.txt):</w:t>
+      </w:r>
+    </w:p>
+    <w:p>
+      <w:pPr>
+        <w:pStyle w:val="ListBullet"/>
+      </w:pPr>
+      <w:r>
+        <w:t>120-column lines, double quotes, four-space indentation, trailing commas in multi-line literals (applied by ruff format — never hand-format against it).</w:t>
+      </w:r>
+    </w:p>
+    <w:p>
+      <w:pPr>
+        <w:pStyle w:val="ListBullet"/>
+      </w:pPr>
+      <w:r>
+        <w:t>No unused imports or variables, no ambiguous single-letter names (pycodestyle + pyflakes rules E, W, F).</w:t>
+      </w:r>
+    </w:p>
+    <w:p>
+      <w:pPr>
+        <w:pStyle w:val="ListBullet"/>
+      </w:pPr>
+      <w:r>
+        <w:t>Imports sorted in three groups — stdlib, third-party (simpy, yaml), first-party (ip_model_automation) — each alphabetized (rule I); models inside the package use relative imports (from .common import ...).</w:t>
+      </w:r>
+    </w:p>
+    <w:p>
+      <w:pPr/>
+      <w:r>
+        <w:t>Structure conventions — the shape every model and test file shares, checked by the scaffold/validation gates and review:</w:t>
+      </w:r>
+    </w:p>
+    <w:p>
+      <w:pPr>
+        <w:pStyle w:val="ListBullet"/>
+      </w:pPr>
+      <w:r>
+        <w:t>Model class &lt;Ip&gt;Model with a short docstring; constructor order is env first, then &lt;operation&gt;_latency parameters (defaulted from the template's timing model), behavioral knobs, and log_level/log_file last.</w:t>
+      </w:r>
+    </w:p>
+    <w:p>
+      <w:pPr>
+        <w:pStyle w:val="ListBullet"/>
+      </w:pPr>
+      <w:r>
+        <w:t>One SimPy process method per template FSM, named &lt;fsm&gt;_process, started in the constructor with env.process(...).</w:t>
+      </w:r>
+    </w:p>
+    <w:p>
+      <w:pPr>
+        <w:pStyle w:val="ListBullet"/>
+      </w:pPr>
+      <w:r>
+        <w:t>Observable state for tests: a metrics counter dict (snake_case keys) and, where useful, an fsm_state dict keyed by FSM name.</w:t>
+      </w:r>
+    </w:p>
+    <w:p>
+      <w:pPr>
+        <w:pStyle w:val="ListBullet"/>
+      </w:pPr>
+      <w:r>
+        <w:t>Logging via get_ip_logger with lazy %s formatting (never f-strings in log calls), at the documented levels (DEBUG transitions, INFO lifecycle, WARNING expected stalls, ERROR invalid paths).</w:t>
+      </w:r>
+    </w:p>
+    <w:p>
+      <w:pPr>
+        <w:pStyle w:val="ListBullet"/>
+      </w:pPr>
+      <w:r>
+        <w:t>Tests use unittest, named after the template's test_scenarios, assert on metrics/completions/state — not log output — and pass small explicit latency overrides so they run in a few simulated ticks.</w:t>
+      </w:r>
+    </w:p>
+    <w:p>
+      <w:pPr/>
+      <w:r>
+        <w:t>One command checks all of it, and the automated pipeline runs the same command as a required repo-wide code_style stage (a hard gate, right before the coverage gate):</w:t>
+      </w:r>
+    </w:p>
+    <w:p>
+      <w:pPr/>
+      <w:r>
+        <w:rPr>
+          <w:rFonts w:ascii="Consolas" w:hAnsi="Consolas"/>
+          <w:sz w:val="19"/>
+        </w:rPr>
+        <w:t>python tools\check_code_style.py          # check - what the pipeline runs</w:t>
+        <w:br/>
+      </w:r>
+      <w:r>
+        <w:rPr>
+          <w:rFonts w:ascii="Consolas" w:hAnsi="Consolas"/>
+          <w:sz w:val="19"/>
+        </w:rPr>
+        <w:t>python tools\check_code_style.py --fix    # apply auto-fixes and reformat</w:t>
+      </w:r>
+    </w:p>
+    <w:p>
+      <w:pPr/>
+      <w:r>
+        <w:t>New models inherit the style at generation time: every prompt pack carries a “Coding Style” section pointing the implementing agent (human or LLM) at the guide, and the generation rules in skills/ip-model-generation/references/model_generation_rules.md include the style check in their validation commands.</w:t>
       </w:r>
     </w:p>
     <w:p>
@@ -1456,6 +1576,12 @@
           <w:i w:val="0"/>
         </w:rPr>
         <w:t>One command — python tools\validate_dld_flow.py — runs the front-end gate for every DLD in the repo (template exists, lints, covers its DLD), then the model/test flow, and regenerates the readable template docs. A single green result proves the whole repo is consistent.</w:t>
+      </w:r>
+    </w:p>
+    <w:p>
+      <w:pPr/>
+      <w:r>
+        <w:t>Two more repo-wide hard gates run in the automated pipeline alongside the chain above: python tools\check_code_style.py (ruff lint + format — the coding style guide's mechanical half) and python tools\run_code_coverage.py --fail-under 95 --fail-under-file 95 — code coverage, which model lines the unit tests actually execute (coverage.py, report in reports\code_coverage\), enforced at 95%+ both in total and per model file.</w:t>
       </w:r>
     </w:p>
     <w:p>
@@ -3543,6 +3669,14 @@
         <w:pStyle w:val="ListBullet"/>
       </w:pPr>
       <w:r>
+        <w:t>A written coding style guide with a ruff-based code_style hard gate keeps all model, tool, and test code on one convention; prompt packs carry the style rules so newly generated models follow it from the start.</w:t>
+      </w:r>
+    </w:p>
+    <w:p>
+      <w:pPr>
+        <w:pStyle w:val="ListBullet"/>
+      </w:pPr>
+      <w:r>
         <w:t>Extractor calibration holds for every golden IP (FSM name set + count reproduce exactly).</w:t>
       </w:r>
     </w:p>

</xml_diff>

<commit_message>
Support any vendor's coding agent for model and test generation
Add named agent_profiles to the harness YAML (claude, codex, gemini as
editable starting points) with the runtime requirements an agent command
must meet, and an --agent <profile> flag on auto_ip_pipeline.py that
resolves them (--agent-cmd stays as a raw override; unknown profiles fail
fast listing the available names). Document the agent as a plug-in point
in the agent contract (new Runtime Requirements section), README, and
project overview (md + docx): the prompt pack plus contract are the full
task description, and the same gates judge the output regardless of which
agent or human wrote the model and tests. Adds a workflow unit test for
profile resolution (suite now 100 tests).

Co-Authored-By: Claude Fable 5 <noreply@anthropic.com>
</commit_message>
<xml_diff>
--- a/docs/project_overview.docx
+++ b/docs/project_overview.docx
@@ -601,7 +601,7 @@
         <w:pStyle w:val="ListBullet"/>
       </w:pPr>
       <w:r>
-        <w:t>runs unattended if you give it an LLM command — it pipes the prompt in, validates the result, and retries with the failure log if validation fails:</w:t>
+        <w:t>runs unattended if you give it a coding agent — any vendor's agent works (Claude, Codex, Gemini, in-house) as long as it runs headless, reads the prompt from stdin, and can edit files. The runner pipes the prompt in, validates the result, and retries with the failure log if validation fails:</w:t>
       </w:r>
     </w:p>
     <w:p>
@@ -616,7 +616,15 @@
           <w:color w:val="202124"/>
           <w:sz w:val="19"/>
         </w:rPr>
-        <w:t>python tools\auto_ip_pipeline.py --agent-cmd "claude -p --permission-mode acceptEdits"</w:t>
+        <w:t>python tools\auto_ip_pipeline.py --agent codex        # named profile from the harness YAML</w:t>
+        <w:br/>
+      </w:r>
+      <w:r>
+        <w:rPr>
+          <w:rFonts w:ascii="Consolas" w:hAnsi="Consolas"/>
+          <w:sz w:val="19"/>
+        </w:rPr>
+        <w:t>python tools\auto_ip_pipeline.py --agent-cmd "my-agent --auto"   # any raw command</w:t>
       </w:r>
     </w:p>
     <w:p>
@@ -1682,7 +1690,21 @@
         <w:t xml:space="preserve">Agent steps: </w:t>
       </w:r>
       <w:r>
-        <w:t>The two agent steps (template review, model implementation) are the only places judgment is needed. Without --agent-cmd, the runner writes the prompt to reports/agent_requests/&lt;ip&gt;.&lt;step&gt;.prompt.md and reports the IP as awaiting. With --agent-cmd, it pipes the prompt to your LLM command and, when validation fails, re-invokes it with the failure log — up to loop_policy.max_iterations from harness/ip_generation_loop.yaml.</w:t>
+        <w:t>The two agent steps (template review, model implementation) are the only places judgment is needed. Without an agent, the runner writes the prompt to reports/agent_requests/&lt;ip&gt;.&lt;step&gt;.prompt.md and reports the IP as awaiting. With --agent &lt;profile&gt; (named commands in the harness YAML's agent_profiles) or --agent-cmd "&lt;raw command&gt;", it pipes the prompt to that command and, when validation fails, re-invokes it with the failure log — up to loop_policy.max_iterations from harness/ip_generation_loop.yaml.</w:t>
+      </w:r>
+    </w:p>
+    <w:p>
+      <w:pPr>
+        <w:pStyle w:val="ListBullet"/>
+      </w:pPr>
+      <w:r>
+        <w:rPr>
+          <w:b/>
+        </w:rPr>
+        <w:t xml:space="preserve">The agent is a plug-in point, not a dependency: </w:t>
+      </w:r>
+      <w:r>
+        <w:t>the prompt pack plus the contract in agents/ip_model_generation_agent.md are the complete task description, and the same gates (template coverage, lint, unit tests, coding style, coverage thresholds) judge the output no matter which vendor's agent — or which human — wrote the model and its tests.</w:t>
       </w:r>
     </w:p>
     <w:p>

</xml_diff>

<commit_message>
Refresh the project overview and flow diagrams to match the pipeline
Update the gate-chain and pipeline-runner diagrams (SVG + md mermaid) for
the repo-wide code style and coverage hard gates and the agent-agnostic
runner; re-render both docx figures at the original 2x scale and rescale
the gates figure frame for its new aspect ratio. Sync overview text: the
template-captures list (FSM relationships, queue capacities), subsystem
ack semantics, the repo tool map, gallery caption, and the Part 5 status
(date and maturity bullets for agent profiles and the template contract).

Co-Authored-By: Claude Fable 5 <noreply@anthropic.com>
</commit_message>
<xml_diff>
--- a/docs/project_overview.docx
+++ b/docs/project_overview.docx
@@ -1528,7 +1528,7 @@
       <w:r>
         <w:drawing>
           <wp:inline xmlns:a="http://schemas.openxmlformats.org/drawingml/2006/main" xmlns:pic="http://schemas.openxmlformats.org/drawingml/2006/picture">
-            <wp:extent cx="4480560" cy="4657424"/>
+            <wp:extent cx="4480560" cy="5305926"/>
             <wp:docPr id="6" name="Picture 6"/>
             <wp:cNvGraphicFramePr>
               <a:graphicFrameLocks noChangeAspect="1"/>
@@ -1549,7 +1549,7 @@
                   <pic:spPr>
                     <a:xfrm>
                       <a:off x="0" y="0"/>
-                      <a:ext cx="4480560" cy="4657424"/>
+                      <a:ext cx="4480560" cy="5305926"/>
                     </a:xfrm>
                     <a:prstGeom prst="rect"/>
                   </pic:spPr>
@@ -1571,7 +1571,7 @@
           <w:color w:val="5F6368"/>
           <w:sz w:val="18"/>
         </w:rPr>
-        <w:t>Figure 6 — The five-check gate chain behind a green validate_dld_flow.py.</w:t>
+        <w:t>Figure 6 — The gate chain behind a green validate_dld_flow.py, plus the repo-wide code style and coverage hard gates.</w:t>
       </w:r>
     </w:p>
     <w:p>
@@ -1725,6 +1725,9 @@
           <w:i w:val="0"/>
         </w:rPr>
         <w:t>A subsystem (several IPs wired together) is modeled as “just another IP”: its FSM processes are the glue between member IP models, and the member models are its resources. It rides the same DLD → template → model → tests pipeline, so every gate applies unchanged. One extra check, tools/check_subsystem_wiring.py, verifies the wiring is real: members exist, the member APIs and glue FSMs referenced by connections: exist, and the model actually instantiates its members.</w:t>
+      </w:r>
+      <w:r>
+        <w:t xml:space="preserve"> Connections can also declare ack semantics — whether the source waits for the destination's done signal (ack: none | completion_event | level_until_serviced, with ack_via naming the return path): the DMA subsystem's IRQ waits for completion events from both legs, and the mailbox IRQ subsystem's doorbell is the level-until-serviced example.</w:t>
       </w:r>
     </w:p>
     <w:p>
@@ -3201,7 +3204,7 @@
           <w:b/>
           <w:i w:val="0"/>
         </w:rPr>
-        <w:t>As of 2026-07-12: all gates green — validate_dld_flow.py OK, full unit suite passing (run it for the current count).</w:t>
+        <w:t>As of 2026-07-13: all gates green — validate_dld_flow.py OK, full unit suite passing (run it for the current count).</w:t>
       </w:r>
     </w:p>
     <w:p>
@@ -3692,6 +3695,22 @@
       </w:pPr>
       <w:r>
         <w:t>A written coding style guide with a ruff-based code_style hard gate keeps all model, tool, and test code on one convention; prompt packs carry the style rules so newly generated models follow it from the start.</w:t>
+      </w:r>
+    </w:p>
+    <w:p>
+      <w:pPr>
+        <w:pStyle w:val="ListBullet"/>
+      </w:pPr>
+      <w:r>
+        <w:t>The pipeline is agent-agnostic: named agent_profiles in the harness YAML (select with --agent &lt;name&gt;) let any vendor's headless coding agent — or a human — fill the two judgment steps; the same gates judge the output.</w:t>
+      </w:r>
+    </w:p>
+    <w:p>
+      <w:pPr>
+        <w:pStyle w:val="ListBullet"/>
+      </w:pPr>
+      <w:r>
+        <w:t>The template contract declares FIFO capacities (bounded depth or explicit unbounded with a reason — lint-enforced) and, for subsystems, per-connection ack semantics (none / completion_event / level_until_serviced).</w:t>
       </w:r>
     </w:p>
     <w:p>

</xml_diff>